<commit_message>
vault backup: 2026-04-12 19:50:48
Affected files:
.obsidian/workspace.json
wkspc/chapter7_final.docx
wkspc/chapter7_output/chapter7_final.docx
wkspc/chapter7_output/figure_list.txt
wkspc/chapter7_output/placeholders/图7-5.png
wkspc/chapter7_output/placeholders/图7-6.png
wkspc/figure_list.txt
wkspc/format_chapter7.py
</commit_message>
<xml_diff>
--- a/wkspc/chapter7_output/chapter7_final.docx
+++ b/wkspc/chapter7_output/chapter7_final.docx
@@ -3870,6 +3870,366 @@
         </w:tc>
       </w:tr>
     </w:tbl>
+    <w:p>
+      <w:pPr>
+        <w:jc w:val="left"/>
+        <w:spacing w:before="480" w:after="120" w:line="400" w:lineRule="exact"/>
+      </w:pPr>
+      <w:r>
+        <w:rPr>
+          <w:rFonts w:ascii="Times New Roman" w:hAnsi="Times New Roman" w:eastAsia="黑体"/>
+          <w:b w:val="0"/>
+          <w:sz w:val="30"/>
+        </w:rPr>
+        <w:t>7.4 集群控制与远程管控</w:t>
+      </w:r>
+    </w:p>
+    <w:p>
+      <w:pPr>
+        <w:ind w:firstLineChars="200"/>
+        <w:spacing w:before="0" w:after="0" w:line="440" w:lineRule="exact"/>
+      </w:pPr>
+      <w:r>
+        <w:rPr>
+          <w:rFonts w:ascii="Times New Roman" w:hAnsi="Times New Roman" w:eastAsia="宋体"/>
+          <w:b w:val="0"/>
+          <w:sz w:val="24"/>
+        </w:rPr>
+        <w:t>隧道暗挖施工涉及掘进、支护、监测、物料调配等多道工序的协同推进，管理链条长、参与角色多、作业空间分散，工程师需在掌子面进行现场巡检，项目经理在办公室审阅监测报告，数据分析人员则在远端开展深度研判。这种多层级、多场景的协同模式，要求监测平台不仅能被动地展示数据，还需主动驱动施工管控流程的闭环运转。然而，传统的隧道监测系统多采用单向数据流模式，工程师发现沉降异常后仍需通过电话或纸质工单通知现场处理，问题跟踪依赖人工记录，处置进度难以量化，难以满足暗挖施工对快速响应和多方协同的管理要求。针对上述问题，本节围绕"集群控制与远程管控"这一主题，从移动端跨平台适配与现场巡检、施工问题工单管理、三维数字孪生可视化、盾构掘进轨迹偏差管控、项目态势总览与智能诊断以及隧道断面风险分级管控六个方面，阐述系统在远程管控层面的设计与实现方案。各功能模块在设计上均遵循"感知—研判—指令—反馈"的管控闭环理念，力求将监测数据的价值转化为可操作的施工管控指令，推动隧道施工现场管理从被动响应向主动干预转变。</w:t>
+      </w:r>
+    </w:p>
+    <w:p>
+      <w:pPr>
+        <w:jc w:val="center"/>
+        <w:spacing w:before="240" w:after="0" w:lineRule="auto" w:line="240"/>
+      </w:pPr>
+      <w:r>
+        <w:drawing>
+          <wp:inline xmlns:a="http://schemas.openxmlformats.org/drawingml/2006/main" xmlns:pic="http://schemas.openxmlformats.org/drawingml/2006/picture">
+            <wp:extent cx="4680000" cy="2880000"/>
+            <wp:docPr id="5" name="Picture 5"/>
+            <wp:cNvGraphicFramePr>
+              <a:graphicFrameLocks noChangeAspect="1"/>
+            </wp:cNvGraphicFramePr>
+            <a:graphic>
+              <a:graphicData uri="http://schemas.openxmlformats.org/drawingml/2006/picture">
+                <pic:pic>
+                  <pic:nvPicPr>
+                    <pic:cNvPr id="0" name="图7-5.png"/>
+                    <pic:cNvPicPr/>
+                  </pic:nvPicPr>
+                  <pic:blipFill>
+                    <a:blip r:embed="rId13"/>
+                    <a:stretch>
+                      <a:fillRect/>
+                    </a:stretch>
+                  </pic:blipFill>
+                  <pic:spPr>
+                    <a:xfrm>
+                      <a:off x="0" y="0"/>
+                      <a:ext cx="4680000" cy="2880000"/>
+                    </a:xfrm>
+                    <a:prstGeom prst="rect"/>
+                  </pic:spPr>
+                </pic:pic>
+              </a:graphicData>
+            </a:graphic>
+          </wp:inline>
+        </w:drawing>
+      </w:r>
+    </w:p>
+    <w:p>
+      <w:pPr>
+        <w:jc w:val="center"/>
+        <w:spacing w:before="120" w:after="240"/>
+      </w:pPr>
+      <w:r>
+        <w:rPr>
+          <w:rFonts w:ascii="Times New Roman" w:hAnsi="Times New Roman" w:eastAsia="宋体"/>
+          <w:b w:val="0"/>
+          <w:sz w:val="21"/>
+        </w:rPr>
+        <w:t>图7-5 集群控制与远程管控功能模块关系图</w:t>
+      </w:r>
+    </w:p>
+    <w:p>
+      <w:pPr>
+        <w:jc w:val="left"/>
+        <w:spacing w:before="240" w:after="120" w:line="400" w:lineRule="exact"/>
+      </w:pPr>
+      <w:r>
+        <w:rPr>
+          <w:rFonts w:ascii="Times New Roman" w:hAnsi="Times New Roman" w:eastAsia="黑体"/>
+          <w:b w:val="0"/>
+          <w:sz w:val="28"/>
+        </w:rPr>
+        <w:t>一、移动端跨平台适配与现场巡检</w:t>
+      </w:r>
+    </w:p>
+    <w:p>
+      <w:pPr>
+        <w:ind w:firstLineChars="200"/>
+        <w:spacing w:before="0" w:after="0" w:line="440" w:lineRule="exact"/>
+      </w:pPr>
+      <w:r>
+        <w:rPr>
+          <w:rFonts w:ascii="Times New Roman" w:hAnsi="Times New Roman" w:eastAsia="宋体"/>
+          <w:b w:val="0"/>
+          <w:sz w:val="24"/>
+        </w:rPr>
+        <w:t>隧道施工现场的移动巡检是远程管控体系的重要环节。工程师在洞内进行日常巡检时，需要随时查看监测点的实时数据、接收预警通知并上报现场问题，而传统的桌面端监测界面在手持终端上的操作体验较差，无法满足移动作业场景下数据查阅与问题反馈的使用需求。为解决这一问题，系统采用Capacitor跨平台框架将Web应用封装为Android原生应用，实现了同一套前端代码库同时服务于桌面端监控大屏与移动端现场巡检两种使用场景。在界面适配方面，系统根据终端屏幕尺寸自动切换布局模式：（1）桌面端采用基于react-grid-layout的磁贴式仪表盘布局，多个监测数据面板以网格形式排布，工程师可根据关注重点自由拖拽调整面板位置，适用于办公室环境下的多维度数据综合研判；（2）移动端自动切换为卡片滑动模式，将各监测面板转化为可逐一切换的独立卡片，每次仅展示一个数据面板，在小屏幕设备上提供清晰的数据阅读体验，适用于洞内光线不足、单手持握等现场操作条件。整套响应式方案覆盖手机、平板和桌面三个终端类型，确保隧道工程从施工现场到项目办公室的多场景使用需求均可得到满足。</w:t>
+      </w:r>
+    </w:p>
+    <w:p>
+      <w:pPr>
+        <w:jc w:val="left"/>
+        <w:spacing w:before="240" w:after="120" w:line="400" w:lineRule="exact"/>
+      </w:pPr>
+      <w:r>
+        <w:rPr>
+          <w:rFonts w:ascii="Times New Roman" w:hAnsi="Times New Roman" w:eastAsia="黑体"/>
+          <w:b w:val="0"/>
+          <w:sz w:val="28"/>
+        </w:rPr>
+        <w:t>二、施工问题工单管理</w:t>
+      </w:r>
+    </w:p>
+    <w:p>
+      <w:pPr>
+        <w:ind w:firstLineChars="200"/>
+        <w:spacing w:before="0" w:after="0" w:line="440" w:lineRule="exact"/>
+      </w:pPr>
+      <w:r>
+        <w:rPr>
+          <w:rFonts w:ascii="Times New Roman" w:hAnsi="Times New Roman" w:eastAsia="宋体"/>
+          <w:b w:val="0"/>
+          <w:sz w:val="24"/>
+        </w:rPr>
+        <w:t>隧道施工过程中，地表沉降超限、结构裂缝扩展、监测设备故障等现场问题的及时发现、分派处理与闭环确认，是保障施工安全的关键管理环节。传统的问题处置方式依赖电话通知或纸质记录，不仅难以追溯处理进度，而且在多个问题并发时容易出现遗漏。为实现施工问题的全流程数字化管控，系统设计了一套工单管理子系统，定义了六种与隧道监测业务紧密对应的工单类型，并为每种类型设置了基于服务等级协议（Service Level Agreement，简称SLA）的基准响应时限：（1）沉降预警工单，用于处理地表沉降量超限或沉降速率异常等紧急情况，基准响应时限为2小时；（2）裂缝预警工单，对应新增裂缝或裂缝宽度扩展等结构安全问题，基准响应时限为3小时；（3）设备故障工单，涵盖传感器失灵、数据采集仪中断等监测硬件问题，基准响应时限为4小时；（4）巡检任务工单，支持监测点定期巡检和设备状态检查等周期性现场核查，基准响应时限为8小时；（5）数据分析工单，用于安排沉降趋势分析、关联性分析等深度数据研判任务，基准响应时限为12小时；（6）维护保养工单，涵盖传感器校准、零部件更换等计划性维护作业，基准响应时限为24小时。上述SLA基准时限并非固定不变，系统引入了优先级动态调整机制：紧急优先级的工单将基准时限压缩至50%，高优先级按75%计算，中优先级保持基准不变，低优先级则放宽至150%。这种分类分级的响应时限计算方式，使得沉降超限等紧急安全问题能够获得最高优先处置，而计划性维护等非紧急任务则允许在更充裕的时间窗口内完成。</w:t>
+      </w:r>
+    </w:p>
+    <w:p>
+      <w:pPr>
+        <w:ind w:firstLineChars="200"/>
+        <w:spacing w:before="0" w:after="0" w:line="440" w:lineRule="exact"/>
+      </w:pPr>
+      <w:r>
+        <w:rPr>
+          <w:rFonts w:ascii="Times New Roman" w:hAnsi="Times New Roman" w:eastAsia="宋体"/>
+          <w:b w:val="0"/>
+          <w:sz w:val="24"/>
+        </w:rPr>
+        <w:t>工单从创建到关闭的全过程通过六个状态进行管控，如图7-6所示。工单创建后进入"待处理"状态，系统根据工单类型自动分派给对应角色的处理人——沉降预警和裂缝预警类工单分配给监测工程师，设备故障和巡检任务类工单分配给现场技术员，数据分析类工单分配给数据分析人员。处理人接单后工单流转至"处理中"状态；若处理过程中因等待配件到货或需要上级审批等原因暂时无法继续推进，可将工单挂起至"已挂起"状态，条件满足后恢复处理。问题解决后工单进入"已解决"状态，系统自动通知工单创建人进行确认；创建人确认无误后工单关闭，若认为问题未彻底解决则可将工单退回要求继续处理。此外，对于明确属于无效报告或重复提交的工单，管理人员可将其标记为"已拒绝"。每一次状态流转均受到角色权限的约束，避免越权操作导致的管理混乱。</w:t>
+      </w:r>
+    </w:p>
+    <w:p>
+      <w:pPr>
+        <w:jc w:val="center"/>
+        <w:spacing w:before="240" w:after="0" w:lineRule="auto" w:line="240"/>
+      </w:pPr>
+      <w:r>
+        <w:drawing>
+          <wp:inline xmlns:a="http://schemas.openxmlformats.org/drawingml/2006/main" xmlns:pic="http://schemas.openxmlformats.org/drawingml/2006/picture">
+            <wp:extent cx="4680000" cy="2880000"/>
+            <wp:docPr id="6" name="Picture 6"/>
+            <wp:cNvGraphicFramePr>
+              <a:graphicFrameLocks noChangeAspect="1"/>
+            </wp:cNvGraphicFramePr>
+            <a:graphic>
+              <a:graphicData uri="http://schemas.openxmlformats.org/drawingml/2006/picture">
+                <pic:pic>
+                  <pic:nvPicPr>
+                    <pic:cNvPr id="0" name="图7-6.png"/>
+                    <pic:cNvPicPr/>
+                  </pic:nvPicPr>
+                  <pic:blipFill>
+                    <a:blip r:embed="rId14"/>
+                    <a:stretch>
+                      <a:fillRect/>
+                    </a:stretch>
+                  </pic:blipFill>
+                  <pic:spPr>
+                    <a:xfrm>
+                      <a:off x="0" y="0"/>
+                      <a:ext cx="4680000" cy="2880000"/>
+                    </a:xfrm>
+                    <a:prstGeom prst="rect"/>
+                  </pic:spPr>
+                </pic:pic>
+              </a:graphicData>
+            </a:graphic>
+          </wp:inline>
+        </w:drawing>
+      </w:r>
+    </w:p>
+    <w:p>
+      <w:pPr>
+        <w:jc w:val="center"/>
+        <w:spacing w:before="120" w:after="240"/>
+      </w:pPr>
+      <w:r>
+        <w:rPr>
+          <w:rFonts w:ascii="Times New Roman" w:hAnsi="Times New Roman" w:eastAsia="宋体"/>
+          <w:b w:val="0"/>
+          <w:sz w:val="21"/>
+        </w:rPr>
+        <w:t>图7-6 工单生命周期状态转换图</w:t>
+      </w:r>
+    </w:p>
+    <w:p>
+      <w:pPr>
+        <w:ind w:firstLineChars="200"/>
+        <w:spacing w:before="0" w:after="0" w:line="440" w:lineRule="exact"/>
+      </w:pPr>
+      <w:r>
+        <w:rPr>
+          <w:rFonts w:ascii="Times New Roman" w:hAnsi="Times New Roman" w:eastAsia="宋体"/>
+          <w:b w:val="0"/>
+          <w:sz w:val="24"/>
+        </w:rPr>
+        <w:t>在工单创建环节，系统针对施工现场操作效率的实际需求，实现了基于自然语言处理（Natural Language Processing，简称NLP）的快捷输入功能。现场工程师在手持终端上可直接输入简短的自然语言描述，系统通过关键词匹配自动识别其中的监测点编号，并根据文本语义自动推断工单类型和优先级，将工单创建时间从传统表单填写的数分钟缩短至数十秒，显著提升了现场问题上报的时效性。在工单跟踪方面，系统部署了后台定时调度服务，周期性执行三项操作：扫描即将到期的工单并向处理人发送提醒通知；检查已超过SLA时限的逾期工单并向处理人和管理人员同时发送告警；将已关闭超过7天的工单自动归档以保持管理界面简洁。通知服务基于SMTP协议实现，支持SSL加密连接，覆盖工单创建、即将到期和已逾期三类通知场景。值得注意的是，工单系统与前文所述的预警分析模块实现了联动——当异常检测引擎识别到沉降指标触发报警阈值时，系统自动创建对应类型的工单并分派至责任人，无需人工介入即可启动问题处置流程，实现了从"监测数据异常感知"到"施工管控指令下达"的全自动闭环。</w:t>
+      </w:r>
+    </w:p>
+    <w:p>
+      <w:pPr>
+        <w:jc w:val="left"/>
+        <w:spacing w:before="240" w:after="120" w:line="400" w:lineRule="exact"/>
+      </w:pPr>
+      <w:r>
+        <w:rPr>
+          <w:rFonts w:ascii="Times New Roman" w:hAnsi="Times New Roman" w:eastAsia="黑体"/>
+          <w:b w:val="0"/>
+          <w:sz w:val="28"/>
+        </w:rPr>
+        <w:t>三、三维数字孪生可视化</w:t>
+      </w:r>
+    </w:p>
+    <w:p>
+      <w:pPr>
+        <w:ind w:firstLineChars="200"/>
+        <w:spacing w:before="0" w:after="0" w:line="440" w:lineRule="exact"/>
+      </w:pPr>
+      <w:r>
+        <w:rPr>
+          <w:rFonts w:ascii="Times New Roman" w:hAnsi="Times New Roman" w:eastAsia="宋体"/>
+          <w:b w:val="0"/>
+          <w:sz w:val="24"/>
+        </w:rPr>
+        <w:t>隧道结构的三维数字孪生可视化是帮助工程师直观理解隧道线型与变形情况的重要手段。与传统的二维断面图和平面展布图相比，三维模型能够同时呈现隧道纵向走势、横断面轮廓和局部变形特征之间的空间关系，便于工程师从全局视角评估施工质量和结构安全状态。系统基于Three.js三维渲染引擎构建了一套隧道数字孪生漫游平台，支持加载GLB/glTF格式的隧道结构模型，并提供里程定位导航、多视角切换和自动巡航等交互功能。在工程架构上，三维可视化模块采用iframe沙箱隔离方案，将Three.js渲染器及其依赖的WebGL上下文封装在独立页面中，避免三维渲染循环与React组件更新机制之间的资源冲突，同时利用浏览器的长期缓存策略减少大体积模型文件的重复加载。在里程导航模式下，工程师输入指定里程桩号后，视角自动定位至该断面位置，可直观查看该处的管片拼装状态和周边变形情况；在自动巡航模式下，视角沿隧道轴线连续推进，工程师可对全线隧道结构进行逐段检视，及时发现异常变形或施工缺陷区段。三维可视化模块与监测数据库实现了关联，工程师在三维场景中选取特定管片或监测点后，可同步调阅该位置的沉降时程曲线、裂缝发展记录等监测信息，实现了空间模型与监测数据的融合展示。</w:t>
+      </w:r>
+    </w:p>
+    <w:p>
+      <w:pPr>
+        <w:jc w:val="left"/>
+        <w:spacing w:before="240" w:after="120" w:line="400" w:lineRule="exact"/>
+      </w:pPr>
+      <w:r>
+        <w:rPr>
+          <w:rFonts w:ascii="Times New Roman" w:hAnsi="Times New Roman" w:eastAsia="黑体"/>
+          <w:b w:val="0"/>
+          <w:sz w:val="28"/>
+        </w:rPr>
+        <w:t>四、盾构掘进轨迹偏差管控</w:t>
+      </w:r>
+    </w:p>
+    <w:p>
+      <w:pPr>
+        <w:ind w:firstLineChars="200"/>
+        <w:spacing w:before="0" w:after="0" w:line="440" w:lineRule="exact"/>
+      </w:pPr>
+      <w:r>
+        <w:rPr>
+          <w:rFonts w:ascii="Times New Roman" w:hAnsi="Times New Roman" w:eastAsia="宋体"/>
+          <w:b w:val="0"/>
+          <w:sz w:val="24"/>
+        </w:rPr>
+        <w:t>盾构机掘进轨迹的实时监控与偏差分析是隧道暗挖施工管控的核心内容之一。盾构机在地下掘进过程中，受地层变化、推力分布不均、刀盘磨损等因素影响，其实际行进轨迹会偏离设计轴线，若偏差累积超出容许范围，将导致管片拼装困难甚至隧道线型不合格。针对这一管控需求，系统设计了盾构轨迹追踪功能，从"轨迹总览""偏差分析"和"风险管控"三个维度为工程师提供掘进过程的精细化管控手段。在轨迹总览界面中，系统以环号为横轴绘制盾构偏差剖面图，同时展示各环的水平偏差和垂直偏差，并叠加滑动均值曲线以滤除单环测量噪声、呈现偏差的整体发展趋势，超出±50毫米警戒线的数据点以醒目标记提示，便于工程师快速定位偏差异常区段。工程师选取某一环后，可进一步查看该环的完整掘进参数，包括俯仰角、偏航角、滚转角三个姿态角度，以及推力、扭矩、土仓面压、推进速率和刀盘转速等关键施工参数。系统对每环偏差执行四级评价：偏差绝对值不超过20毫米判定为"正常"，20至35毫米为"关注"，35至50毫米为"警告"，超过50毫米判定为"超限"。在偏差分析方面，系统内置纠偏建议引擎，自动统计最近若干环的偏差均值并与预设的规则库进行匹配，输出针对性的纠偏操作指导——例如"建议适当增加左侧推力以修正右偏趋势"或"建议降低推进速率以控制垂直偏差"。此外，系统还通过逐环累加偏航角变化量的方式计算累积水平偏移量，为工程师评估隧道全线线型质量提供定量依据。</w:t>
+      </w:r>
+    </w:p>
+    <w:p>
+      <w:pPr>
+        <w:jc w:val="left"/>
+        <w:spacing w:before="240" w:after="120" w:line="400" w:lineRule="exact"/>
+      </w:pPr>
+      <w:r>
+        <w:rPr>
+          <w:rFonts w:ascii="Times New Roman" w:hAnsi="Times New Roman" w:eastAsia="黑体"/>
+          <w:b w:val="0"/>
+          <w:sz w:val="28"/>
+        </w:rPr>
+        <w:t>五、项目态势总览与智能诊断</w:t>
+      </w:r>
+    </w:p>
+    <w:p>
+      <w:pPr>
+        <w:ind w:firstLineChars="200"/>
+        <w:spacing w:before="0" w:after="0" w:line="440" w:lineRule="exact"/>
+      </w:pPr>
+      <w:r>
+        <w:rPr>
+          <w:rFonts w:ascii="Times New Roman" w:hAnsi="Times New Roman" w:eastAsia="宋体"/>
+          <w:b w:val="0"/>
+          <w:sz w:val="24"/>
+        </w:rPr>
+        <w:t>总览仪表盘是系统面向项目管理层的态势感知中枢，其设计目标是帮助管理者从繁杂的多源监测数据中快速把握项目整体安全状态。仪表盘的核心是一套规则化的诊断评分机制：系统以100分为基准，根据各监测点的报警等级、沉降速率、累计变化量和趋势预测等不利因素逐项扣减，最终生成一个0至100分的项目健康评分，并映射为"健康""关注""警告""危险"四个等级。这种量化评分机制使得项目管理者无需逐一翻阅各监测点的数据曲线，即可在短时间内掌握项目整体安全态势。在评分结果的基础上，系统进一步构建了监测要素之间的关联网络，将报警或预警状态的监测点作为核心节点，以图形化方式揭示超限、速率异常、趋势异常等不同类型问题之间的因果关联——例如当多个相邻监测点同时呈现加速沉降趋势时，系统自动标注"同步加速，疑似区域性地层失稳"的关联提示，引导工程师关注系统性风险。仪表盘还将诊断结果转化为面向不同角色的具体操作指令：面向施工工程师的指令侧重于现场复测和加密监测等即时行动；面向数据分析人员的指令侧重于空间关联分析等深度研判任务；面向项目管理者的指令则侧重于施工方案调整等宏观决策建议。</w:t>
+      </w:r>
+    </w:p>
+    <w:p>
+      <w:pPr>
+        <w:jc w:val="left"/>
+        <w:spacing w:before="240" w:after="120" w:line="400" w:lineRule="exact"/>
+      </w:pPr>
+      <w:r>
+        <w:rPr>
+          <w:rFonts w:ascii="Times New Roman" w:hAnsi="Times New Roman" w:eastAsia="黑体"/>
+          <w:b w:val="0"/>
+          <w:sz w:val="28"/>
+        </w:rPr>
+        <w:t>六、隧道断面风险分级管控</w:t>
+      </w:r>
+    </w:p>
+    <w:p>
+      <w:pPr>
+        <w:ind w:firstLineChars="200"/>
+        <w:spacing w:before="0" w:after="0" w:line="440" w:lineRule="exact"/>
+      </w:pPr>
+      <w:r>
+        <w:rPr>
+          <w:rFonts w:ascii="Times New Roman" w:hAnsi="Times New Roman" w:eastAsia="宋体"/>
+          <w:b w:val="0"/>
+          <w:sz w:val="24"/>
+        </w:rPr>
+        <w:t>隧道断面管理模块为工程师提供了从宏观到微观的多层级风险管控视图。该模块采用"项目—线路—风险区段"的三级导航结构，将选定线路按照指定的里程间距划分为若干连续区段，对每个区段综合考虑区段内监测点的当前变化量、变化速率、报警等级和监测点密度等因素，计算综合风险评分并划入安全、关注、警告和危险四个风险等级。系统以里程为横轴绘制全线风险评分分布曲线，工程师可直观识别风险集中区段，同时界面展示排名前列的高风险区段列表，列出各区段的起止里程、监测点数量、最大变化量和风险评分等关键信息，便于快速定位需重点关注的施工地段。隧道断面管理模块与工单系统之间实现了联动：当工程师确认某些区段的风险评分超出管控阈值后，可触发自动工单生成功能，系统将超标区段的风险信息批量转化为施工工单，工单中自动填写区段的起止里程、风险评分和主要风险因素等关键信息。该功能将风险分析结果直接转化为可执行的施工管控任务，是"感知—研判—指令"管控链条在隧道断面维度上的具体体现。</w:t>
+      </w:r>
+    </w:p>
+    <w:p>
+      <w:pPr>
+        <w:jc w:val="left"/>
+        <w:spacing w:before="240" w:after="120" w:line="400" w:lineRule="exact"/>
+      </w:pPr>
+      <w:r>
+        <w:rPr>
+          <w:rFonts w:ascii="Times New Roman" w:hAnsi="Times New Roman" w:eastAsia="黑体"/>
+          <w:b w:val="0"/>
+          <w:sz w:val="28"/>
+        </w:rPr>
+        <w:t>七、本节小结</w:t>
+      </w:r>
+    </w:p>
+    <w:p>
+      <w:pPr>
+        <w:ind w:firstLineChars="200"/>
+        <w:spacing w:before="0" w:after="0" w:line="440" w:lineRule="exact"/>
+      </w:pPr>
+      <w:r>
+        <w:rPr>
+          <w:rFonts w:ascii="Times New Roman" w:hAnsi="Times New Roman" w:eastAsia="宋体"/>
+          <w:b w:val="0"/>
+          <w:sz w:val="24"/>
+        </w:rPr>
+        <w:t>综上所述，本节围绕集群控制与远程管控的主题，主要完成了以下工作：（1）采用Capacitor跨平台框架实现了监测平台的移动端适配，桌面端基于react-grid-layout提供可拖拽的磁贴式仪表盘布局，移动端自动切换为卡片滑动模式，满足了从施工现场到项目办公室的多场景协同管理需求；（2）设计了涵盖六类工单和基于SLA的分级响应时限管理体系，通过NLP快捷输入、后台定时调度和SMTP邮件通知实现了工单全生命周期的数字化管控，并与预警分析模块实现了自动联动，形成了从"异常感知"到"工单下达"的管控闭环；（3）基于Three.js渲染引擎和GLB/glTF模型格式构建了隧道结构三维数字孪生漫游平台，采用iframe沙箱隔离方案解决了三维渲染与前端框架的资源冲突问题，支持里程定位导航和自动巡航检视，实现了空间模型与监测数据的融合展示；（4）建立了盾构掘进轨迹的环级偏差监控与四级评价体系，并通过纠偏建议引擎为工程师提供针对性的操作指导；（5）开发了面向项目管理层的总览仪表盘和隧道断面风险分级管控功能，通过量化健康评分和分区段风险评估，将分散的监测数据凝练为可直接指导行动的管控决策依据。上述功能模块共同构成了一套覆盖"现场巡检—问题上报—智能研判—指令下达—处置闭环"全流程的远程管控体系。</w:t>
+      </w:r>
+    </w:p>
     <w:sectPr>
       <w:pgSz w:w="11906" w:h="16838"/>
       <w:pgMar w:top="1417" w:right="1417" w:bottom="1417" w:left="1701" w:header="720" w:footer="720" w:gutter="0"/>

</xml_diff>